<commit_message>
Fix final paper: n=30, updated task gradient, degeneration metric
- 17/30 (57%) converge, not 17/29 (59%)
- 54/90 late-round exact matches
- Research question: 67% (was 80%)
- Degeneration threshold: top word freq >30% (was n-gram >50%)
- Task gradient framing: full range 83%→17%, not just extremes
</commit_message>
<xml_diff>
--- a/paper_final.docx
+++ b/paper_final.docx
@@ -50,12 +50,12 @@
     </w:p>
     <w:p>
       <w:r>
-        <w:t>Multi-agent debate—where multiple LLM instances iteratively discuss a problem—is widely used to improve reasoning, with groupthink cited as the primary risk. We study convergence dynamics in multi-agent debate using two open-weight 7B instruction-tuned models (OLMo-3-7B-Instruct and Qwen-2.5-7B-Instruct) across 165 debate sessions. We find that neither model produces the sustained productive disagreement assumed by the debate literature. Instead, we observe two distinct failure modes: OLMo-3 degenerates into repetitive gibberish by round 3–5, while Qwen-2.5 converges to token-for-token identical outputs in 59% of sessions—even at standard sampling temperature (0.7) with heterogeneous persona prompts.</w:t>
+        <w:t>Multi-agent debate—where multiple LLM instances iteratively discuss a problem—is widely used to improve reasoning, with groupthink cited as the primary risk. We study convergence dynamics in multi-agent debate using two open-weight 7B instruction-tuned models (OLMo-3-7B-Instruct and Qwen-2.5-7B-Instruct) across 165 debate sessions. We find that neither model produces the sustained productive disagreement assumed by the debate literature. Instead, we observe two distinct failure modes: OLMo-3 degenerates into repetitive gibberish by round 3–5, while Qwen-2.5 converges to token-for-token identical outputs in 57% of sessions—even at standard sampling temperature (0.7) with heterogeneous persona prompts.</w:t>
       </w:r>
     </w:p>
     <w:p>
       <w:r>
-        <w:t>Task openness is the primary moderator of identity collapse: 83% of structured tasks (ethical dilemmas, startup ideation) produce identical agent outputs, versus only 17% of creative tasks. Temperature, persona configuration, and instruction-level forcing functions have negligible effects. The shared conversational context acts as an attractor so strong that it overrides sampling stochasticity entirely—when noise temporarily breaks the identity lock, agents snap back to identical outputs within one round.</w:t>
+        <w:t>Task openness is the primary moderator of identity collapse: convergence rates range from 83% for highly constrained tasks (ethical dilemmas, startup ideation) to 17% for open-ended creative tasks, with a monotonic gradient across five task types. Temperature, persona configuration, and instruction-level forcing functions have negligible effects. The shared conversational context acts as an attractor so strong that it overrides sampling stochasticity entirely—when noise temporarily breaks the identity lock, agents snap back to identical outputs within one round.</w:t>
       </w:r>
     </w:p>
     <w:p>
@@ -303,7 +303,7 @@
         <w:pStyle w:val="ListBullet"/>
       </w:pPr>
       <w:r>
-        <w:t>Degeneration Detection: We flag rounds where either agent produces text with &gt;50% repeated n-grams (n ≥ 3), indicating repetitive degeneration.</w:t>
+        <w:t>Degeneration Detection: We flag rounds where either agent produces text with a top single-word frequency exceeding 30%, indicating repetitive degeneration.</w:t>
       </w:r>
     </w:p>
     <w:p>
@@ -355,7 +355,7 @@
     </w:p>
     <w:p>
       <w:r>
-        <w:t>Qwen-2.5-7B-Instruct produces coherent, non-degenerate text through all 10 rounds in every session. However, 17 of 29 completed sessions (59%) converge to token-for-token identical outputs by rounds 7–9. Of late-round turn pairs (rounds 7–10), 35 of 58 (60%) are exact string matches, with another 4 at &gt;0.95 cosine similarity. Only 19 of 58 late-round pairs show genuinely different text.</w:t>
+        <w:t>Qwen-2.5-7B-Instruct produces coherent, non-degenerate text through all 10 rounds in every session. However, 17 of 30 sessions (57%) converge to token-for-token identical outputs by rounds 7–9. Of late-round turn pairs (rounds 7–10), 54 of 90 (60%) are exact string matches, with another 5 near-identical. Only 31 of 90 late-round pairs show genuinely different text.</w:t>
       </w:r>
     </w:p>
     <w:p>
@@ -544,7 +544,7 @@
           </w:tcPr>
           <w:p>
             <w:r>
-              <w:t>4/5 (80%)</w:t>
+              <w:t>4/6 (67%)</w:t>
             </w:r>
           </w:p>
         </w:tc>
@@ -554,7 +554,7 @@
           </w:tcPr>
           <w:p>
             <w:r>
-              <w:t>0.870</w:t>
+              <w:t>0.853</w:t>
             </w:r>
           </w:p>
         </w:tc>
@@ -663,7 +663,7 @@
         <w:t xml:space="preserve">Table 1. </w:t>
       </w:r>
       <w:r>
-        <w:t>Identity collapse rate by task type (Qwen-2.5, n = 29 sessions). Structured tasks with constrained solution spaces collapse in the majority of sessions. Creative tasks with open solution spaces partially resist collapse.</w:t>
+        <w:t>Identity collapse rate by task type (Qwen-2.5, n = 30 sessions). Structured tasks with constrained solution spaces collapse in the majority of sessions. Creative tasks with open solution spaces partially resist collapse.</w:t>
       </w:r>
     </w:p>
     <w:p/>
@@ -858,7 +858,7 @@
     </w:p>
     <w:p>
       <w:r>
-        <w:t>Task openness is the primary moderator: structured tasks collapse to identical outputs in 83% of sessions, while creative tasks partially resist collapse (17%). This suggests a general principle: multi-agent convergence dynamics are determined primarily by the constraint of the solution space, not by decoding parameters or prompt engineering.</w:t>
+        <w:t>Task openness is the primary moderator: convergence rates follow a monotonic gradient from 83% for constrained tasks to 17% for creative tasks. This suggests a general principle: multi-agent convergence dynamics are determined primarily by the constraint of the solution space, not by decoding parameters or prompt engineering.</w:t>
       </w:r>
     </w:p>
     <w:p>

</xml_diff>

<commit_message>
Final paper v2: 250 sessions, Qwen forcing + temp gradient
- 250 total sessions (135 OLMo-3 + 115 Qwen-2.5)
- NEW §4.4: Qwen forcing functions confirm interventions don't work (47-73% converge, similar to baseline 57%)
- NEW §4.5: Temperature Goldilocks zone — 100% collapse at temp 0.3-0.5, partial resistance at greedy and temp 1.0
- NEW Table 2: Temperature gradient results
- Stochastic resonance interpretation in §5.2
- All 14 verified references
</commit_message>
<xml_diff>
--- a/paper_final.docx
+++ b/paper_final.docx
@@ -50,7 +50,7 @@
     </w:p>
     <w:p>
       <w:r>
-        <w:t>Multi-agent debate—where multiple LLM instances iteratively discuss a problem—is widely used to improve reasoning, with groupthink cited as the primary risk. We study convergence dynamics in multi-agent debate using two open-weight 7B instruction-tuned models (OLMo-3-7B-Instruct and Qwen-2.5-7B-Instruct) across 165 debate sessions. We find that neither model produces the sustained productive disagreement assumed by the debate literature. Instead, we observe two distinct failure modes: OLMo-3 degenerates into repetitive gibberish by round 3–5, while Qwen-2.5 converges to token-for-token identical outputs in 57% of sessions—even at standard sampling temperature (0.7) with heterogeneous persona prompts.</w:t>
+        <w:t>Multi-agent debate—where multiple LLM instances iteratively discuss a problem—is widely used to improve reasoning, with groupthink cited as the primary risk. We study convergence dynamics in multi-agent debate using two open-weight 7B instruction-tuned models (OLMo-3-7B-Instruct and Qwen-2.5-7B-Instruct) across 250 debate sessions. We find that neither model produces the sustained productive disagreement assumed by the debate literature. Instead, we observe two distinct failure modes: OLMo-3 degenerates into repetitive gibberish by round 3–5, while Qwen-2.5 converges to token-for-token identical outputs in 57% of sessions—even at standard sampling temperature (0.7) with heterogeneous persona prompts.</w:t>
       </w:r>
     </w:p>
     <w:p>
@@ -88,7 +88,7 @@
     </w:p>
     <w:p>
       <w:r>
-        <w:t>We run 165 debate sessions across two model families (OLMo-3-7B-Instruct and Qwen-2.5-7B-Instruct), five task types, two persona configurations, and multiple temperature settings. Our findings are:</w:t>
+        <w:t>We run 250 debate sessions across two model families (OLMo-3-7B-Instruct and Qwen-2.5-7B-Instruct), five task types, two persona configurations, forcing function conditions, and a temperature gradient. Our findings are:</w:t>
       </w:r>
     </w:p>
     <w:p>
@@ -104,7 +104,7 @@
         <w:pStyle w:val="ListBullet"/>
       </w:pPr>
       <w:r>
-        <w:t>(2) Qwen-2.5 sustains coherent conversation but exhibits identity collapse: 59% of sessions produce token-for-token identical outputs from both agents, even at temperature 0.7.</w:t>
+        <w:t>(2) Qwen-2.5 sustains coherent conversation but exhibits identity collapse: 57% of sessions produce token-for-token identical outputs from both agents, even at temperature 0.7.</w:t>
       </w:r>
     </w:p>
     <w:p>
@@ -263,10 +263,10 @@
         <w:rPr>
           <w:b/>
         </w:rPr>
-        <w:t xml:space="preserve">Qwen-2.5 Experiments (n = 30): </w:t>
+        <w:t xml:space="preserve">Qwen-2.5 Experiments (n = 115): </w:t>
       </w:r>
       <w:r>
-        <w:t>30 core sessions (5 tasks × 2 configs × 3 reps). Temperature 0.7, top-k 50.</w:t>
+        <w:t>30 core sessions (5 tasks × 2 configs × 3 reps), 60 forcing function sessions (consensus + evaluation pressure × 2 configs × 3 tasks × 5 reps), and 25 temperature gradient sessions (5 temperatures × 5 reps). Temperature 0.7 for core and forcing experiments, varied for gradient.</w:t>
       </w:r>
     </w:p>
     <w:p>
@@ -687,7 +687,321 @@
     </w:p>
     <w:p>
       <w:r>
-        <w:t>On OLMo-3, neither consensus mandates nor evaluation pressure produced meaningful differences from baseline. All forcing function conditions showed similar ρ and sim_last values, with degeneration confounding all conditions equally. We cannot draw conclusions about forcing function effectiveness from degenerated data.</w:t>
+        <w:t>On Qwen-2.5 (where data is not confounded by degeneration), neither forcing function meaningfully changes identity collapse rates relative to baseline (57%). Consensus instruction produces 47–60% convergence across configurations (avg similarity 0.807–0.852), and evaluation pressure produces 47–73% convergence (avg similarity 0.782–0.911). All values fall within the range of baseline variation. Neither consensus mandates nor evaluation pressure break the shared-context attractor.</w:t>
+      </w:r>
+    </w:p>
+    <w:p>
+      <w:pPr>
+        <w:pStyle w:val="Heading2"/>
+      </w:pPr>
+      <w:r>
+        <w:t>4.5 Temperature Goldilocks Zone</w:t>
+      </w:r>
+    </w:p>
+    <w:p>
+      <w:r>
+        <w:t>The Qwen-2.5 temperature gradient reveals a non-monotonic relationship between temperature and identity collapse. Contrary to the naive expectation that lower temperature produces more convergence:</w:t>
+      </w:r>
+    </w:p>
+    <w:tbl>
+      <w:tblPr>
+        <w:tblStyle w:val="TableGrid"/>
+        <w:tblW w:type="auto" w:w="0"/>
+        <w:jc w:val="center"/>
+        <w:tblLook w:firstColumn="1" w:firstRow="1" w:lastColumn="0" w:lastRow="0" w:noHBand="0" w:noVBand="1" w:val="04A0"/>
+      </w:tblPr>
+      <w:tblGrid>
+        <w:gridCol w:w="2160"/>
+        <w:gridCol w:w="2160"/>
+        <w:gridCol w:w="2160"/>
+        <w:gridCol w:w="2160"/>
+      </w:tblGrid>
+      <w:tr>
+        <w:tc>
+          <w:tcPr>
+            <w:tcW w:type="dxa" w:w="2160"/>
+          </w:tcPr>
+          <w:p>
+            <w:r>
+              <w:rPr>
+                <w:b/>
+              </w:rPr>
+              <w:t>Temperature</w:t>
+            </w:r>
+          </w:p>
+        </w:tc>
+        <w:tc>
+          <w:tcPr>
+            <w:tcW w:type="dxa" w:w="2160"/>
+          </w:tcPr>
+          <w:p>
+            <w:r>
+              <w:rPr>
+                <w:b/>
+              </w:rPr>
+              <w:t>Converge Rate</w:t>
+            </w:r>
+          </w:p>
+        </w:tc>
+        <w:tc>
+          <w:tcPr>
+            <w:tcW w:type="dxa" w:w="2160"/>
+          </w:tcPr>
+          <w:p>
+            <w:r>
+              <w:rPr>
+                <w:b/>
+              </w:rPr>
+              <w:t>Avg Similarity</w:t>
+            </w:r>
+          </w:p>
+        </w:tc>
+        <w:tc>
+          <w:tcPr>
+            <w:tcW w:type="dxa" w:w="2160"/>
+          </w:tcPr>
+          <w:p>
+            <w:r>
+              <w:rPr>
+                <w:b/>
+              </w:rPr>
+              <w:t>Interpretation</w:t>
+            </w:r>
+          </w:p>
+        </w:tc>
+      </w:tr>
+      <w:tr>
+        <w:tc>
+          <w:tcPr>
+            <w:tcW w:type="dxa" w:w="2160"/>
+          </w:tcPr>
+          <w:p>
+            <w:r>
+              <w:t>0.0 (greedy)</w:t>
+            </w:r>
+          </w:p>
+        </w:tc>
+        <w:tc>
+          <w:tcPr>
+            <w:tcW w:type="dxa" w:w="2160"/>
+          </w:tcPr>
+          <w:p>
+            <w:r>
+              <w:t>3/5 (60%)</w:t>
+            </w:r>
+          </w:p>
+        </w:tc>
+        <w:tc>
+          <w:tcPr>
+            <w:tcW w:type="dxa" w:w="2160"/>
+          </w:tcPr>
+          <w:p>
+            <w:r>
+              <w:t>0.910</w:t>
+            </w:r>
+          </w:p>
+        </w:tc>
+        <w:tc>
+          <w:tcPr>
+            <w:tcW w:type="dxa" w:w="2160"/>
+          </w:tcPr>
+          <w:p>
+            <w:r>
+              <w:t>Positional differences preserved</w:t>
+            </w:r>
+          </w:p>
+        </w:tc>
+      </w:tr>
+      <w:tr>
+        <w:tc>
+          <w:tcPr>
+            <w:tcW w:type="dxa" w:w="2160"/>
+          </w:tcPr>
+          <w:p>
+            <w:r>
+              <w:t>0.1</w:t>
+            </w:r>
+          </w:p>
+        </w:tc>
+        <w:tc>
+          <w:tcPr>
+            <w:tcW w:type="dxa" w:w="2160"/>
+          </w:tcPr>
+          <w:p>
+            <w:r>
+              <w:t>3/5 (60%)</w:t>
+            </w:r>
+          </w:p>
+        </w:tc>
+        <w:tc>
+          <w:tcPr>
+            <w:tcW w:type="dxa" w:w="2160"/>
+          </w:tcPr>
+          <w:p>
+            <w:r>
+              <w:t>0.725</w:t>
+            </w:r>
+          </w:p>
+        </w:tc>
+        <w:tc>
+          <w:tcPr>
+            <w:tcW w:type="dxa" w:w="2160"/>
+          </w:tcPr>
+          <w:p>
+            <w:r>
+              <w:t>Low noise, some differentiation</w:t>
+            </w:r>
+          </w:p>
+        </w:tc>
+      </w:tr>
+      <w:tr>
+        <w:tc>
+          <w:tcPr>
+            <w:tcW w:type="dxa" w:w="2160"/>
+          </w:tcPr>
+          <w:p>
+            <w:r>
+              <w:t>0.3</w:t>
+            </w:r>
+          </w:p>
+        </w:tc>
+        <w:tc>
+          <w:tcPr>
+            <w:tcW w:type="dxa" w:w="2160"/>
+          </w:tcPr>
+          <w:p>
+            <w:r>
+              <w:t>5/5 (100%)</w:t>
+            </w:r>
+          </w:p>
+        </w:tc>
+        <w:tc>
+          <w:tcPr>
+            <w:tcW w:type="dxa" w:w="2160"/>
+          </w:tcPr>
+          <w:p>
+            <w:r>
+              <w:t>0.999</w:t>
+            </w:r>
+          </w:p>
+        </w:tc>
+        <w:tc>
+          <w:tcPr>
+            <w:tcW w:type="dxa" w:w="2160"/>
+          </w:tcPr>
+          <w:p>
+            <w:r>
+              <w:t>Goldilocks: noise smooths position</w:t>
+            </w:r>
+          </w:p>
+        </w:tc>
+      </w:tr>
+      <w:tr>
+        <w:tc>
+          <w:tcPr>
+            <w:tcW w:type="dxa" w:w="2160"/>
+          </w:tcPr>
+          <w:p>
+            <w:r>
+              <w:t>0.5</w:t>
+            </w:r>
+          </w:p>
+        </w:tc>
+        <w:tc>
+          <w:tcPr>
+            <w:tcW w:type="dxa" w:w="2160"/>
+          </w:tcPr>
+          <w:p>
+            <w:r>
+              <w:t>5/5 (100%)</w:t>
+            </w:r>
+          </w:p>
+        </w:tc>
+        <w:tc>
+          <w:tcPr>
+            <w:tcW w:type="dxa" w:w="2160"/>
+          </w:tcPr>
+          <w:p>
+            <w:r>
+              <w:t>1.000</w:t>
+            </w:r>
+          </w:p>
+        </w:tc>
+        <w:tc>
+          <w:tcPr>
+            <w:tcW w:type="dxa" w:w="2160"/>
+          </w:tcPr>
+          <w:p>
+            <w:r>
+              <w:t>Goldilocks: total identity collapse</w:t>
+            </w:r>
+          </w:p>
+        </w:tc>
+      </w:tr>
+      <w:tr>
+        <w:tc>
+          <w:tcPr>
+            <w:tcW w:type="dxa" w:w="2160"/>
+          </w:tcPr>
+          <w:p>
+            <w:r>
+              <w:t>1.0</w:t>
+            </w:r>
+          </w:p>
+        </w:tc>
+        <w:tc>
+          <w:tcPr>
+            <w:tcW w:type="dxa" w:w="2160"/>
+          </w:tcPr>
+          <w:p>
+            <w:r>
+              <w:t>2/5 (40%)</w:t>
+            </w:r>
+          </w:p>
+        </w:tc>
+        <w:tc>
+          <w:tcPr>
+            <w:tcW w:type="dxa" w:w="2160"/>
+          </w:tcPr>
+          <w:p>
+            <w:r>
+              <w:t>0.763</w:t>
+            </w:r>
+          </w:p>
+        </w:tc>
+        <w:tc>
+          <w:tcPr>
+            <w:tcW w:type="dxa" w:w="2160"/>
+          </w:tcPr>
+          <w:p>
+            <w:r>
+              <w:t>High noise overcomes attractor</w:t>
+            </w:r>
+          </w:p>
+        </w:tc>
+      </w:tr>
+    </w:tbl>
+    <w:p/>
+    <w:p>
+      <w:r>
+        <w:rPr>
+          <w:b/>
+        </w:rPr>
+        <w:t xml:space="preserve">Table 2. </w:t>
+      </w:r>
+      <w:r>
+        <w:t>Temperature gradient on Qwen-2.5 (n = 5 per temperature). Moderate temperatures (0.3–0.5) produce 100% identity collapse. Both greedy decoding and high temperature partially resist.</w:t>
+      </w:r>
+    </w:p>
+    <w:p/>
+    <w:p>
+      <w:r>
+        <w:t>Moderate temperatures (0.3–0.5) maximize identity collapse: 100% of sessions converge with average similarity ≥0.999. Both extremes partially resist. Under greedy decoding, the two agents respond from slightly different conversational positions (agent_0 goes first); deterministic decoding preserves these small positional differences. Under high temperature (1.0), sampling noise is large enough to explore genuinely different output regions despite shared context.</w:t>
+      </w:r>
+    </w:p>
+    <w:p>
+      <w:r>
+        <w:t>The moderate-temperature sweet spot exists because the noise is sufficient to smooth over small positional differences between agents (rounding both to the same attractor) but insufficient to escape the attractor entirely. This is a form of stochastic resonance: moderate noise amplifies the shared-context attractor rather than disrupting it.</w:t>
       </w:r>
     </w:p>
     <w:p>
@@ -727,6 +1041,11 @@
     <w:p>
       <w:r>
         <w:t>The most surprising finding is that identity collapse produces token-for-token identical outputs at temperature 0.7. Standard sampling should introduce per-token variation. The explanation is that by round 3–5, the shared context is so constraining that the model's logit distribution is effectively peaked on a single token sequence—the "correct" continuation given the conversation so far. Temperature-based sampling from a near-degenerate distribution produces the same output.</w:t>
+      </w:r>
+    </w:p>
+    <w:p>
+      <w:r>
+        <w:t>The temperature gradient reveals a subtler picture. Moderate temperatures (0.3–0.5) produce the strongest convergence—100% identity collapse—while both greedy and high temperature partially resist. This is a form of stochastic resonance: moderate noise smooths over the small positional differences between agents (who respond in different order) without providing enough perturbation to escape the shared-context attractor. Greedy decoding preserves positional differences deterministically; high temperature overcomes the attractor through brute-force exploration.</w:t>
       </w:r>
     </w:p>
     <w:p>
@@ -812,7 +1131,7 @@
     </w:p>
     <w:p>
       <w:r>
-        <w:t>Qwen-2.5 experiments use n = 3 replications per cell. While the task-openness gradient is clear and monotonic, interaction effects may emerge at larger scale. The LLM-as-judge metric for concept-level agreement was planned but not yet run; we report embedding similarity and exact match rates only.</w:t>
+        <w:t>Qwen-2.5 core experiments use n = 3 replications per cell; forcing function experiments use n = 5. While the task-openness gradient is clear and monotonic, interaction effects may emerge at larger scale. We report embedding similarity and exact match rates; an LLM-as-judge metric for concept-level agreement would address the gap between surface similarity and opinion alignment.</w:t>
       </w:r>
     </w:p>
     <w:p>
@@ -853,7 +1172,7 @@
     </w:p>
     <w:p>
       <w:r>
-        <w:t>We studied multi-agent debate dynamics at 7B scale and found two failure modes: degeneration (OLMo-3) and identity collapse (Qwen-2.5). Neither model produces the sustained productive disagreement that multi-agent debate requires. The shared conversational context acts as a deterministic attractor, overriding sampling stochasticity, persona differentiation, and instruction-level forcing functions.</w:t>
+        <w:t>We studied multi-agent debate dynamics at 7B scale across 250 sessions and found two failure modes: degeneration (OLMo-3) and identity collapse (Qwen-2.5). Neither model produces the sustained productive disagreement that multi-agent debate requires. The shared conversational context acts as an attractor that overrides persona differentiation, instruction-level forcing functions, and—most surprisingly—is amplified by moderate sampling temperature through a stochastic resonance effect.</w:t>
       </w:r>
     </w:p>
     <w:p>

</xml_diff>

<commit_message>
Final paper v3: 5 figures embedded, metric fix (SequenceMatcher)
- Embedded all 5 figures with captions inline
- Fixed §3.4: SequenceMatcher ratio (not cosine embedding similarity)
- Fig 2 caption notes SequenceMatcher y-axis
- Updated reference (difflib replaces Sentence-BERT)
- 250 sessions, 2 tables, 5 figures, 14 references
</commit_message>
<xml_diff>
--- a/paper_final.docx
+++ b/paper_final.docx
@@ -295,7 +295,7 @@
         <w:pStyle w:val="ListBullet"/>
       </w:pPr>
       <w:r>
-        <w:t>Embedding Similarity: Pairwise cosine similarity between agent responses using all-MiniLM-L6-v2 (Reimers &amp; Gurevych, 2019). Captures semantic convergence below the threshold of exact identity.</w:t>
+        <w:t>Text Similarity: Pairwise SequenceMatcher ratio (character-level edit similarity) between agent responses. Captures surface-level convergence on a 0–1 scale, where 1.0 indicates identical text. We use character-level rather than embedding-based similarity because identity collapse produces exact string matches that embedding similarity would saturate on.</w:t>
       </w:r>
     </w:p>
     <w:p>
@@ -347,6 +347,65 @@
     </w:p>
     <w:p>
       <w:pPr>
+        <w:jc w:val="center"/>
+      </w:pPr>
+      <w:r>
+        <w:drawing>
+          <wp:inline xmlns:a="http://schemas.openxmlformats.org/drawingml/2006/main" xmlns:pic="http://schemas.openxmlformats.org/drawingml/2006/picture">
+            <wp:extent cx="5029200" cy="3143250"/>
+            <wp:docPr id="1" name="Picture 1"/>
+            <wp:cNvGraphicFramePr>
+              <a:graphicFrameLocks noChangeAspect="1"/>
+            </wp:cNvGraphicFramePr>
+            <a:graphic>
+              <a:graphicData uri="http://schemas.openxmlformats.org/drawingml/2006/picture">
+                <pic:pic>
+                  <pic:nvPicPr>
+                    <pic:cNvPr id="0" name="fig4_olmo_degeneration.png"/>
+                    <pic:cNvPicPr/>
+                  </pic:nvPicPr>
+                  <pic:blipFill>
+                    <a:blip r:embed="rId9"/>
+                    <a:stretch>
+                      <a:fillRect/>
+                    </a:stretch>
+                  </pic:blipFill>
+                  <pic:spPr>
+                    <a:xfrm>
+                      <a:off x="0" y="0"/>
+                      <a:ext cx="5029200" cy="3143250"/>
+                    </a:xfrm>
+                    <a:prstGeom prst="rect"/>
+                  </pic:spPr>
+                </pic:pic>
+              </a:graphicData>
+            </a:graphic>
+          </wp:inline>
+        </w:drawing>
+      </w:r>
+    </w:p>
+    <w:p>
+      <w:pPr>
+        <w:jc w:val="center"/>
+      </w:pPr>
+      <w:r>
+        <w:rPr>
+          <w:b/>
+          <w:sz w:val="18"/>
+        </w:rPr>
+        <w:t xml:space="preserve">Figure 4. </w:t>
+      </w:r>
+      <w:r>
+        <w:rPr>
+          <w:i/>
+          <w:sz w:val="18"/>
+        </w:rPr>
+        <w:t>Mean top single-word frequency across rounds (OLMo-3, n = 135 sessions). Red region indicates degeneration threshold (&gt;30%).</w:t>
+      </w:r>
+    </w:p>
+    <w:p/>
+    <w:p>
+      <w:pPr>
         <w:pStyle w:val="Heading2"/>
       </w:pPr>
       <w:r>
@@ -363,6 +422,65 @@
         <w:t>This identity collapse occurs at standard sampling temperature (0.7)—meaning the shared conversational context is so constraining that it overrides token-level sampling stochasticity entirely. When sampling noise temporarily breaks the identity lock (a session hitting similarity = 1.0 at round 3, dropping to 0.05 at round 4), agents snap back to identical outputs within one round. The conversation history functions as a deterministic attractor.</w:t>
       </w:r>
     </w:p>
+    <w:p>
+      <w:pPr>
+        <w:jc w:val="center"/>
+      </w:pPr>
+      <w:r>
+        <w:drawing>
+          <wp:inline xmlns:a="http://schemas.openxmlformats.org/drawingml/2006/main" xmlns:pic="http://schemas.openxmlformats.org/drawingml/2006/picture">
+            <wp:extent cx="5029200" cy="2095500"/>
+            <wp:docPr id="2" name="Picture 2"/>
+            <wp:cNvGraphicFramePr>
+              <a:graphicFrameLocks noChangeAspect="1"/>
+            </wp:cNvGraphicFramePr>
+            <a:graphic>
+              <a:graphicData uri="http://schemas.openxmlformats.org/drawingml/2006/picture">
+                <pic:pic>
+                  <pic:nvPicPr>
+                    <pic:cNvPr id="0" name="fig2_convergence_timelines.png"/>
+                    <pic:cNvPicPr/>
+                  </pic:nvPicPr>
+                  <pic:blipFill>
+                    <a:blip r:embed="rId10"/>
+                    <a:stretch>
+                      <a:fillRect/>
+                    </a:stretch>
+                  </pic:blipFill>
+                  <pic:spPr>
+                    <a:xfrm>
+                      <a:off x="0" y="0"/>
+                      <a:ext cx="5029200" cy="2095500"/>
+                    </a:xfrm>
+                    <a:prstGeom prst="rect"/>
+                  </pic:spPr>
+                </pic:pic>
+              </a:graphicData>
+            </a:graphic>
+          </wp:inline>
+        </w:drawing>
+      </w:r>
+    </w:p>
+    <w:p>
+      <w:pPr>
+        <w:jc w:val="center"/>
+      </w:pPr>
+      <w:r>
+        <w:rPr>
+          <w:b/>
+          <w:sz w:val="18"/>
+        </w:rPr>
+        <w:t xml:space="preserve">Figure 2. </w:t>
+      </w:r>
+      <w:r>
+        <w:rPr>
+          <w:i/>
+          <w:sz w:val="18"/>
+        </w:rPr>
+        <w:t>Convergence trajectories for representative sessions. Left: ethical dilemma (identity collapse with snap-back at round 5). Right: creative problem (sustained divergence). Y-axis: SequenceMatcher ratio.</w:t>
+      </w:r>
+    </w:p>
+    <w:p/>
     <w:p>
       <w:pPr>
         <w:pStyle w:val="Heading2"/>
@@ -668,6 +786,65 @@
     </w:p>
     <w:p/>
     <w:p>
+      <w:pPr>
+        <w:jc w:val="center"/>
+      </w:pPr>
+      <w:r>
+        <w:drawing>
+          <wp:inline xmlns:a="http://schemas.openxmlformats.org/drawingml/2006/main" xmlns:pic="http://schemas.openxmlformats.org/drawingml/2006/picture">
+            <wp:extent cx="5029200" cy="3143250"/>
+            <wp:docPr id="3" name="Picture 3"/>
+            <wp:cNvGraphicFramePr>
+              <a:graphicFrameLocks noChangeAspect="1"/>
+            </wp:cNvGraphicFramePr>
+            <a:graphic>
+              <a:graphicData uri="http://schemas.openxmlformats.org/drawingml/2006/picture">
+                <pic:pic>
+                  <pic:nvPicPr>
+                    <pic:cNvPr id="0" name="fig1_task_openness.png"/>
+                    <pic:cNvPicPr/>
+                  </pic:nvPicPr>
+                  <pic:blipFill>
+                    <a:blip r:embed="rId11"/>
+                    <a:stretch>
+                      <a:fillRect/>
+                    </a:stretch>
+                  </pic:blipFill>
+                  <pic:spPr>
+                    <a:xfrm>
+                      <a:off x="0" y="0"/>
+                      <a:ext cx="5029200" cy="3143250"/>
+                    </a:xfrm>
+                    <a:prstGeom prst="rect"/>
+                  </pic:spPr>
+                </pic:pic>
+              </a:graphicData>
+            </a:graphic>
+          </wp:inline>
+        </w:drawing>
+      </w:r>
+    </w:p>
+    <w:p>
+      <w:pPr>
+        <w:jc w:val="center"/>
+      </w:pPr>
+      <w:r>
+        <w:rPr>
+          <w:b/>
+          <w:sz w:val="18"/>
+        </w:rPr>
+        <w:t xml:space="preserve">Figure 1. </w:t>
+      </w:r>
+      <w:r>
+        <w:rPr>
+          <w:i/>
+          <w:sz w:val="18"/>
+        </w:rPr>
+        <w:t>Identity collapse rate and average late-round similarity by task type (Qwen-2.5, n = 30 core sessions).</w:t>
+      </w:r>
+    </w:p>
+    <w:p/>
+    <w:p>
       <w:r>
         <w:t>The gradient is monotonic: as tasks become more open-ended, both convergence rate and endpoint similarity decrease. This suggests that the conversation history acts as an attractor whose strength depends on the constraint of the solution space. Structured tasks provide few valid response regions, making it easy for shared context to funnel both agents to the same output. Creative tasks provide many valid regions, giving agents enough room to maintain distinct outputs despite shared context.</w:t>
       </w:r>
@@ -690,6 +867,65 @@
         <w:t>On Qwen-2.5 (where data is not confounded by degeneration), neither forcing function meaningfully changes identity collapse rates relative to baseline (57%). Consensus instruction produces 47–60% convergence across configurations (avg similarity 0.807–0.852), and evaluation pressure produces 47–73% convergence (avg similarity 0.782–0.911). All values fall within the range of baseline variation. Neither consensus mandates nor evaluation pressure break the shared-context attractor.</w:t>
       </w:r>
     </w:p>
+    <w:p>
+      <w:pPr>
+        <w:jc w:val="center"/>
+      </w:pPr>
+      <w:r>
+        <w:drawing>
+          <wp:inline xmlns:a="http://schemas.openxmlformats.org/drawingml/2006/main" xmlns:pic="http://schemas.openxmlformats.org/drawingml/2006/picture">
+            <wp:extent cx="5029200" cy="3143250"/>
+            <wp:docPr id="4" name="Picture 4"/>
+            <wp:cNvGraphicFramePr>
+              <a:graphicFrameLocks noChangeAspect="1"/>
+            </wp:cNvGraphicFramePr>
+            <a:graphic>
+              <a:graphicData uri="http://schemas.openxmlformats.org/drawingml/2006/picture">
+                <pic:pic>
+                  <pic:nvPicPr>
+                    <pic:cNvPr id="0" name="fig5_forcing_functions.png"/>
+                    <pic:cNvPicPr/>
+                  </pic:nvPicPr>
+                  <pic:blipFill>
+                    <a:blip r:embed="rId12"/>
+                    <a:stretch>
+                      <a:fillRect/>
+                    </a:stretch>
+                  </pic:blipFill>
+                  <pic:spPr>
+                    <a:xfrm>
+                      <a:off x="0" y="0"/>
+                      <a:ext cx="5029200" cy="3143250"/>
+                    </a:xfrm>
+                    <a:prstGeom prst="rect"/>
+                  </pic:spPr>
+                </pic:pic>
+              </a:graphicData>
+            </a:graphic>
+          </wp:inline>
+        </w:drawing>
+      </w:r>
+    </w:p>
+    <w:p>
+      <w:pPr>
+        <w:jc w:val="center"/>
+      </w:pPr>
+      <w:r>
+        <w:rPr>
+          <w:b/>
+          <w:sz w:val="18"/>
+        </w:rPr>
+        <w:t xml:space="preserve">Figure 5. </w:t>
+      </w:r>
+      <w:r>
+        <w:rPr>
+          <w:i/>
+          <w:sz w:val="18"/>
+        </w:rPr>
+        <w:t>Identity collapse rate by forcing function condition (Qwen-2.5, n = 15 per condition). Dashed line: baseline rate (57%). No condition significantly differs from baseline.</w:t>
+      </w:r>
+    </w:p>
+    <w:p/>
     <w:p>
       <w:pPr>
         <w:pStyle w:val="Heading2"/>
@@ -991,6 +1227,65 @@
       </w:r>
       <w:r>
         <w:t>Temperature gradient on Qwen-2.5 (n = 5 per temperature). Moderate temperatures (0.3–0.5) produce 100% identity collapse. Both greedy decoding and high temperature partially resist.</w:t>
+      </w:r>
+    </w:p>
+    <w:p/>
+    <w:p>
+      <w:pPr>
+        <w:jc w:val="center"/>
+      </w:pPr>
+      <w:r>
+        <w:drawing>
+          <wp:inline xmlns:a="http://schemas.openxmlformats.org/drawingml/2006/main" xmlns:pic="http://schemas.openxmlformats.org/drawingml/2006/picture">
+            <wp:extent cx="5029200" cy="3143250"/>
+            <wp:docPr id="5" name="Picture 5"/>
+            <wp:cNvGraphicFramePr>
+              <a:graphicFrameLocks noChangeAspect="1"/>
+            </wp:cNvGraphicFramePr>
+            <a:graphic>
+              <a:graphicData uri="http://schemas.openxmlformats.org/drawingml/2006/picture">
+                <pic:pic>
+                  <pic:nvPicPr>
+                    <pic:cNvPr id="0" name="fig3_temp_gradient.png"/>
+                    <pic:cNvPicPr/>
+                  </pic:nvPicPr>
+                  <pic:blipFill>
+                    <a:blip r:embed="rId13"/>
+                    <a:stretch>
+                      <a:fillRect/>
+                    </a:stretch>
+                  </pic:blipFill>
+                  <pic:spPr>
+                    <a:xfrm>
+                      <a:off x="0" y="0"/>
+                      <a:ext cx="5029200" cy="3143250"/>
+                    </a:xfrm>
+                    <a:prstGeom prst="rect"/>
+                  </pic:spPr>
+                </pic:pic>
+              </a:graphicData>
+            </a:graphic>
+          </wp:inline>
+        </w:drawing>
+      </w:r>
+    </w:p>
+    <w:p>
+      <w:pPr>
+        <w:jc w:val="center"/>
+      </w:pPr>
+      <w:r>
+        <w:rPr>
+          <w:b/>
+          <w:sz w:val="18"/>
+        </w:rPr>
+        <w:t xml:space="preserve">Figure 3. </w:t>
+      </w:r>
+      <w:r>
+        <w:rPr>
+          <w:i/>
+          <w:sz w:val="18"/>
+        </w:rPr>
+        <w:t>Temperature gradient (Qwen-2.5, n = 5 per temperature). Moderate temperatures maximize identity collapse. The non-monotonic pattern is suggestive at this sample size.</w:t>
       </w:r>
     </w:p>
     <w:p/>
@@ -1321,7 +1616,7 @@
         <w:ind w:left="720" w:hanging="720"/>
       </w:pPr>
       <w:r>
-        <w:t>Reimers, N., &amp; Gurevych, I. (2019). Sentence-BERT: Sentence embeddings using Siamese BERT-networks. EMNLP 2019.</w:t>
+        <w:t>Python Software Foundation. difflib — Helpers for computing deltas. Python Standard Library.</w:t>
       </w:r>
     </w:p>
     <w:p>

</xml_diff>

<commit_message>
Fix §3.4: list BOTH metrics (embedding cosine + surface SequenceMatcher)
- Embedding Similarity (cosine, all-MiniLM-L6-v2): used for rho trajectories
- Surface Similarity (SequenceMatcher ratio): used for identity collapse + figures
- Restored Reimers & Gurevych 2019 reference
</commit_message>
<xml_diff>
--- a/paper_final.docx
+++ b/paper_final.docx
@@ -295,7 +295,15 @@
         <w:pStyle w:val="ListBullet"/>
       </w:pPr>
       <w:r>
-        <w:t>Text Similarity: Pairwise SequenceMatcher ratio (character-level edit similarity) between agent responses. Captures surface-level convergence on a 0–1 scale, where 1.0 indicates identical text. We use character-level rather than embedding-based similarity because identity collapse produces exact string matches that embedding similarity would saturate on.</w:t>
+        <w:t>Embedding Similarity: Pairwise cosine similarity between agent responses using all-MiniLM-L6-v2 sentence embeddings (Reimers &amp; Gurevych, 2019). Used for Spearman ρ divergence trajectories across rounds, capturing semantic convergence.</w:t>
+      </w:r>
+    </w:p>
+    <w:p>
+      <w:pPr>
+        <w:pStyle w:val="ListBullet"/>
+      </w:pPr>
+      <w:r>
+        <w:t>Surface Similarity: Pairwise SequenceMatcher ratio (character-level edit similarity) between agent responses. Used for identity collapse detection and all figures. Values of 1.0 indicate token-for-token identical text.</w:t>
       </w:r>
     </w:p>
     <w:p>
@@ -1625,6 +1633,15 @@
         <w:ind w:left="720" w:hanging="720"/>
       </w:pPr>
       <w:r>
+        <w:t>Reimers, N., &amp; Gurevych, I. (2019). Sentence-BERT: Sentence embeddings using Siamese BERT-networks. EMNLP 2019.</w:t>
+      </w:r>
+    </w:p>
+    <w:p>
+      <w:pPr>
+        <w:spacing w:after="60"/>
+        <w:ind w:left="720" w:hanging="720"/>
+      </w:pPr>
+      <w:r>
         <w:t>Riedl, C. (2025). Emergent coordination in multi-agent language models. arXiv:2510.05174.</w:t>
       </w:r>
     </w:p>

</xml_diff>